<commit_message>
Wordy 21219-9, -15, -16: obrázky a úklid po přenosu z Markdownu
- 21219-15: obrázek 2 jako vložený objekt OLE nahrazen obrázkem (stejný jako
  v repozitáři a na webu)
- 21219-16: odebrán diagram, který není v Markdownu ani na webu
- 21219-9: obrázky 1 a 2 složené z obrázku a popisků přes něj nahrazeny
  složenými obrázky
- odstraněny odstavce „```xml“ a „```“, které tam omylem vložil přenos
  z Markdownu

Co-Authored-By: Claude Opus 5.5 <noreply@anthropic.com>
Claude-Session: https://claude.ai/code/session_013XsG4Ss77xGbwrRyA4pUBh
</commit_message>
<xml_diff>
--- a/extrakty/doc/TC278WG4/extract_21219-15_(2020).docx
+++ b/extrakty/doc/TC278WG4/extract_21219-15_(2020).docx
@@ -1572,6 +1572,45 @@
     <w:p>
       <w:pPr>
         <w:keepNext/>
+      </w:pPr>
+      <w:r>
+        <w:drawing>
+          <wp:inline xmlns:a="http://schemas.openxmlformats.org/drawingml/2006/main" xmlns:pic="http://schemas.openxmlformats.org/drawingml/2006/picture">
+            <wp:extent cx="5040000" cy="1508662"/>
+            <wp:docPr id="4" name="Picture 4"/>
+            <wp:cNvGraphicFramePr>
+              <a:graphicFrameLocks noChangeAspect="1"/>
+            </wp:cNvGraphicFramePr>
+            <a:graphic>
+              <a:graphicData uri="http://schemas.openxmlformats.org/drawingml/2006/picture">
+                <pic:pic>
+                  <pic:nvPicPr>
+                    <pic:cNvPr id="0" name="21219-15_2019_image3.png"/>
+                    <pic:cNvPicPr/>
+                  </pic:nvPicPr>
+                  <pic:blipFill>
+                    <a:blip r:embed="rId15"/>
+                    <a:stretch>
+                      <a:fillRect/>
+                    </a:stretch>
+                  </pic:blipFill>
+                  <pic:spPr>
+                    <a:xfrm>
+                      <a:off x="0" y="0"/>
+                      <a:ext cx="5040000" cy="1508662"/>
+                    </a:xfrm>
+                    <a:prstGeom prst="rect"/>
+                  </pic:spPr>
+                </pic:pic>
+              </a:graphicData>
+            </a:graphic>
+          </wp:inline>
+        </w:drawing>
+      </w:r>
+    </w:p>
+    <w:p>
+      <w:pPr>
+        <w:keepNext/>
         <w:autoSpaceDE w:val="0"/>
         <w:autoSpaceDN w:val="0"/>
         <w:adjustRightInd w:val="0"/>
@@ -1580,33 +1619,6 @@
           <w:b/>
         </w:rPr>
       </w:pPr>
-      <w:r>
-        <w:object w:dxaOrig="11329" w:dyaOrig="3390" w14:anchorId="5E13F515">
-          <v:shapetype id="_x0000_t75" coordsize="21600,21600" o:spt="75" o:preferrelative="t" path="m@4@5l@4@11@9@11@9@5xe" filled="f" stroked="f">
-            <v:stroke joinstyle="miter"/>
-            <v:formulas>
-              <v:f eqn="if lineDrawn pixelLineWidth 0"/>
-              <v:f eqn="sum @0 1 0"/>
-              <v:f eqn="sum 0 0 @1"/>
-              <v:f eqn="prod @2 1 2"/>
-              <v:f eqn="prod @3 21600 pixelWidth"/>
-              <v:f eqn="prod @3 21600 pixelHeight"/>
-              <v:f eqn="sum @0 0 1"/>
-              <v:f eqn="prod @6 1 2"/>
-              <v:f eqn="prod @7 21600 pixelWidth"/>
-              <v:f eqn="sum @8 21600 0"/>
-              <v:f eqn="prod @7 21600 pixelHeight"/>
-              <v:f eqn="sum @10 21600 0"/>
-            </v:formulas>
-            <v:path o:extrusionok="f" gradientshapeok="t" o:connecttype="rect"/>
-            <o:lock v:ext="edit" aspectratio="t"/>
-          </v:shapetype>
-          <v:shape id="_x0000_i1025" type="#_x0000_t75" style="width:764.35pt;height:225.2pt" o:ole="">
-            <v:imagedata r:id="rId10" o:title=""/>
-          </v:shape>
-          <o:OLEObject Type="Embed" ProgID="Visio.Drawing.11" ShapeID="_x0000_i1025" DrawAspect="Content" ObjectID="_1650801752" r:id="rId11"/>
-        </w:object>
-      </w:r>
       <w:r>
         <w:rPr>
           <w:b/>
@@ -6580,11 +6592,6 @@
       </w:r>
     </w:p>
     <w:p>
-      <w:r>
-        <w:t xml:space="preserve">```xml</w:t>
-      </w:r>
-    </w:p>
-    <w:p>
       <w:pPr>
         <w:pStyle w:val="Example"/>
         <w:pBdr>
@@ -7111,24 +7118,6 @@
           <w:color w:val="000000"/>
         </w:rPr>
         <w:t> </w:t>
-      </w:r>
-    </w:p>
-    <w:p>
-      <w:pPr>
-        <w:pStyle w:val="Example"/>
-        <w:pBdr>
-          <w:top w:val="single" w:sz="4" w:space="1" w:color="auto"/>
-          <w:left w:val="single" w:sz="4" w:space="4" w:color="auto"/>
-          <w:bottom w:val="single" w:sz="4" w:space="1" w:color="auto"/>
-          <w:right w:val="single" w:sz="4" w:space="4" w:color="auto"/>
-        </w:pBdr>
-      </w:pPr>
-      <w:r>
-        <w:rPr>
-          <w:rFonts w:ascii="Courier New" w:hAnsi="Courier New" w:cs="Courier New"/>
-          <w:color w:val="000000"/>
-        </w:rPr>
-        <w:t xml:space="preserve">```</w:t>
       </w:r>
     </w:p>
     <w:p>

</xml_diff>